<commit_message>
Add cry-sound detection review and update combined report
Co-Authored-By: Claude Sonnet 5.5 <noreply@anthropic.com>
Claude-Session: https://claude.ai/code/session_01YUs4ThZR7vyJGPPKhVC9wX
</commit_message>
<xml_diff>
--- a/research/04_맞춤동화_RAG_제안.docx
+++ b/research/04_맞춤동화_RAG_제안.docx
@@ -6313,7 +6313,19 @@
         <w:pStyle w:val="BodyText"/>
       </w:pPr>
       <w:r>
-        <w:t xml:space="preserve">위험 신호 감지(울음 분석)는 건강·안전과 직결되어 오류의 영향이 크다. 도입한다면 의료 판단이 아니라는 면책과 별도 검증이 필요하다.</w:t>
+        <w:t xml:space="preserve">위험 신호 감지(울음 분석)는 건강·안전과 직결되어 오류의 영향이 크다. 도입한다면 의료 판단이 아니라는 면책과 별도 검증이 필요하다. 모델 후보, 한계, 보완 방법은</w:t>
+      </w:r>
+      <w:r>
+        <w:t xml:space="preserve"> </w:t>
+      </w:r>
+      <w:r>
+        <w:rPr>
+          <w:rStyle w:val="VerbatimChar"/>
+        </w:rPr>
+        <w:t xml:space="preserve">05_울음소리_분석_검토</w:t>
+      </w:r>
+      <w:r>
+        <w:t xml:space="preserve">에 정리했다.</w:t>
       </w:r>
     </w:p>
     <w:bookmarkEnd w:id="46"/>

</xml_diff>